<commit_message>
docs(srs): sync requirements with the implemented system
Apply sections 1 and 2 of the SRS review (ES and EN; Markdown, Word and PDF):
- FR-001: registration with name, email, password and terms acceptance
- FR-204: interface in Spanish, English, French and Portuguese
- FR-502: in-app and email channels only, no push (ADR-007)
- FR-403: store confidence and source engine, not a model reference
- Dependencies: MediaPipe Tasks Vision, own TF.js 54-sign model, SMTP; no Firebase
- Table 18 and conclusions: real matrix figures (47/10/20/2 of 79)
- Note that the status of RF8-RF11 is pending a team decision
- Remove FR-007 (admin-only permanent block is not implemented)
</commit_message>
<xml_diff>
--- a/01_INFORME_DE_ESPECIFICACION_DE_REQUISITOS/EN/WORD/01_Requirements_Specification_Report.docx
+++ b/01_INFORME_DE_ESPECIFICACION_DE_REQUISITOS/EN/WORD/01_Requirements_Specification_Report.docx
@@ -593,7 +593,7 @@
         </w:rPr>
         <w:fldChar w:fldCharType="separate"/>
       </w:r>
-      <w:hyperlink w:anchor="_Toc242459286" w:history="1">
+      <w:hyperlink w:anchor="_Toc244002811" w:history="1">
         <w:r>
           <w:rPr>
             <w:rStyle w:val="Hipervnculo"/>
@@ -621,7 +621,7 @@
             <w:noProof/>
             <w:webHidden/>
           </w:rPr>
-          <w:instrText xml:space="preserve"> PAGEREF _Toc242459286 \h </w:instrText>
+          <w:instrText xml:space="preserve"> PAGEREF _Toc244002811 \h </w:instrText>
         </w:r>
         <w:r>
           <w:rPr>
@@ -669,7 +669,7 @@
           <w14:ligatures w14:val="standardContextual"/>
         </w:rPr>
       </w:pPr>
-      <w:hyperlink w:anchor="_Toc242459287" w:history="1">
+      <w:hyperlink w:anchor="_Toc244002812" w:history="1">
         <w:r>
           <w:rPr>
             <w:rStyle w:val="Hipervnculo"/>
@@ -697,7 +697,7 @@
             <w:noProof/>
             <w:webHidden/>
           </w:rPr>
-          <w:instrText xml:space="preserve"> PAGEREF _Toc242459287 \h </w:instrText>
+          <w:instrText xml:space="preserve"> PAGEREF _Toc244002812 \h </w:instrText>
         </w:r>
         <w:r>
           <w:rPr>
@@ -745,7 +745,7 @@
           <w14:ligatures w14:val="standardContextual"/>
         </w:rPr>
       </w:pPr>
-      <w:hyperlink w:anchor="_Toc242459288" w:history="1">
+      <w:hyperlink w:anchor="_Toc244002813" w:history="1">
         <w:r>
           <w:rPr>
             <w:rStyle w:val="Hipervnculo"/>
@@ -773,7 +773,7 @@
             <w:noProof/>
             <w:webHidden/>
           </w:rPr>
-          <w:instrText xml:space="preserve"> PAGEREF _Toc242459288 \h </w:instrText>
+          <w:instrText xml:space="preserve"> PAGEREF _Toc244002813 \h </w:instrText>
         </w:r>
         <w:r>
           <w:rPr>
@@ -821,7 +821,7 @@
           <w14:ligatures w14:val="standardContextual"/>
         </w:rPr>
       </w:pPr>
-      <w:hyperlink w:anchor="_Toc242459289" w:history="1">
+      <w:hyperlink w:anchor="_Toc244002814" w:history="1">
         <w:r>
           <w:rPr>
             <w:rStyle w:val="Hipervnculo"/>
@@ -849,7 +849,7 @@
             <w:noProof/>
             <w:webHidden/>
           </w:rPr>
-          <w:instrText xml:space="preserve"> PAGEREF _Toc242459289 \h </w:instrText>
+          <w:instrText xml:space="preserve"> PAGEREF _Toc244002814 \h </w:instrText>
         </w:r>
         <w:r>
           <w:rPr>
@@ -897,7 +897,7 @@
           <w14:ligatures w14:val="standardContextual"/>
         </w:rPr>
       </w:pPr>
-      <w:hyperlink w:anchor="_Toc242459290" w:history="1">
+      <w:hyperlink w:anchor="_Toc244002815" w:history="1">
         <w:r>
           <w:rPr>
             <w:rStyle w:val="Hipervnculo"/>
@@ -925,7 +925,7 @@
             <w:noProof/>
             <w:webHidden/>
           </w:rPr>
-          <w:instrText xml:space="preserve"> PAGEREF _Toc242459290 \h </w:instrText>
+          <w:instrText xml:space="preserve"> PAGEREF _Toc244002815 \h </w:instrText>
         </w:r>
         <w:r>
           <w:rPr>
@@ -973,7 +973,7 @@
           <w14:ligatures w14:val="standardContextual"/>
         </w:rPr>
       </w:pPr>
-      <w:hyperlink w:anchor="_Toc242459291" w:history="1">
+      <w:hyperlink w:anchor="_Toc244002816" w:history="1">
         <w:r>
           <w:rPr>
             <w:rStyle w:val="Hipervnculo"/>
@@ -1001,7 +1001,7 @@
             <w:noProof/>
             <w:webHidden/>
           </w:rPr>
-          <w:instrText xml:space="preserve"> PAGEREF _Toc242459291 \h </w:instrText>
+          <w:instrText xml:space="preserve"> PAGEREF _Toc244002816 \h </w:instrText>
         </w:r>
         <w:r>
           <w:rPr>
@@ -1049,7 +1049,7 @@
           <w14:ligatures w14:val="standardContextual"/>
         </w:rPr>
       </w:pPr>
-      <w:hyperlink w:anchor="_Toc242459292" w:history="1">
+      <w:hyperlink w:anchor="_Toc244002817" w:history="1">
         <w:r>
           <w:rPr>
             <w:rStyle w:val="Hipervnculo"/>
@@ -1077,7 +1077,7 @@
             <w:noProof/>
             <w:webHidden/>
           </w:rPr>
-          <w:instrText xml:space="preserve"> PAGEREF _Toc242459292 \h </w:instrText>
+          <w:instrText xml:space="preserve"> PAGEREF _Toc244002817 \h </w:instrText>
         </w:r>
         <w:r>
           <w:rPr>
@@ -1125,7 +1125,7 @@
           <w14:ligatures w14:val="standardContextual"/>
         </w:rPr>
       </w:pPr>
-      <w:hyperlink w:anchor="_Toc242459293" w:history="1">
+      <w:hyperlink w:anchor="_Toc244002818" w:history="1">
         <w:r>
           <w:rPr>
             <w:rStyle w:val="Hipervnculo"/>
@@ -1153,7 +1153,7 @@
             <w:noProof/>
             <w:webHidden/>
           </w:rPr>
-          <w:instrText xml:space="preserve"> PAGEREF _Toc242459293 \h </w:instrText>
+          <w:instrText xml:space="preserve"> PAGEREF _Toc244002818 \h </w:instrText>
         </w:r>
         <w:r>
           <w:rPr>
@@ -1201,7 +1201,7 @@
           <w14:ligatures w14:val="standardContextual"/>
         </w:rPr>
       </w:pPr>
-      <w:hyperlink w:anchor="_Toc242459294" w:history="1">
+      <w:hyperlink w:anchor="_Toc244002819" w:history="1">
         <w:r>
           <w:rPr>
             <w:rStyle w:val="Hipervnculo"/>
@@ -1229,7 +1229,7 @@
             <w:noProof/>
             <w:webHidden/>
           </w:rPr>
-          <w:instrText xml:space="preserve"> PAGEREF _Toc242459294 \h </w:instrText>
+          <w:instrText xml:space="preserve"> PAGEREF _Toc244002819 \h </w:instrText>
         </w:r>
         <w:r>
           <w:rPr>
@@ -1277,7 +1277,7 @@
           <w14:ligatures w14:val="standardContextual"/>
         </w:rPr>
       </w:pPr>
-      <w:hyperlink w:anchor="_Toc242459295" w:history="1">
+      <w:hyperlink w:anchor="_Toc244002820" w:history="1">
         <w:r>
           <w:rPr>
             <w:rStyle w:val="Hipervnculo"/>
@@ -1305,7 +1305,7 @@
             <w:noProof/>
             <w:webHidden/>
           </w:rPr>
-          <w:instrText xml:space="preserve"> PAGEREF _Toc242459295 \h </w:instrText>
+          <w:instrText xml:space="preserve"> PAGEREF _Toc244002820 \h </w:instrText>
         </w:r>
         <w:r>
           <w:rPr>
@@ -1353,7 +1353,7 @@
           <w14:ligatures w14:val="standardContextual"/>
         </w:rPr>
       </w:pPr>
-      <w:hyperlink w:anchor="_Toc242459296" w:history="1">
+      <w:hyperlink w:anchor="_Toc244002821" w:history="1">
         <w:r>
           <w:rPr>
             <w:rStyle w:val="Hipervnculo"/>
@@ -1381,7 +1381,7 @@
             <w:noProof/>
             <w:webHidden/>
           </w:rPr>
-          <w:instrText xml:space="preserve"> PAGEREF _Toc242459296 \h </w:instrText>
+          <w:instrText xml:space="preserve"> PAGEREF _Toc244002821 \h </w:instrText>
         </w:r>
         <w:r>
           <w:rPr>
@@ -1429,7 +1429,7 @@
           <w14:ligatures w14:val="standardContextual"/>
         </w:rPr>
       </w:pPr>
-      <w:hyperlink w:anchor="_Toc242459297" w:history="1">
+      <w:hyperlink w:anchor="_Toc244002822" w:history="1">
         <w:r>
           <w:rPr>
             <w:rStyle w:val="Hipervnculo"/>
@@ -1457,7 +1457,7 @@
             <w:noProof/>
             <w:webHidden/>
           </w:rPr>
-          <w:instrText xml:space="preserve"> PAGEREF _Toc242459297 \h </w:instrText>
+          <w:instrText xml:space="preserve"> PAGEREF _Toc244002822 \h </w:instrText>
         </w:r>
         <w:r>
           <w:rPr>
@@ -1505,7 +1505,7 @@
           <w14:ligatures w14:val="standardContextual"/>
         </w:rPr>
       </w:pPr>
-      <w:hyperlink w:anchor="_Toc242459298" w:history="1">
+      <w:hyperlink w:anchor="_Toc244002823" w:history="1">
         <w:r>
           <w:rPr>
             <w:rStyle w:val="Hipervnculo"/>
@@ -1533,7 +1533,7 @@
             <w:noProof/>
             <w:webHidden/>
           </w:rPr>
-          <w:instrText xml:space="preserve"> PAGEREF _Toc242459298 \h </w:instrText>
+          <w:instrText xml:space="preserve"> PAGEREF _Toc244002823 \h </w:instrText>
         </w:r>
         <w:r>
           <w:rPr>
@@ -1581,7 +1581,7 @@
           <w14:ligatures w14:val="standardContextual"/>
         </w:rPr>
       </w:pPr>
-      <w:hyperlink w:anchor="_Toc242459299" w:history="1">
+      <w:hyperlink w:anchor="_Toc244002824" w:history="1">
         <w:r>
           <w:rPr>
             <w:rStyle w:val="Hipervnculo"/>
@@ -1609,7 +1609,7 @@
             <w:noProof/>
             <w:webHidden/>
           </w:rPr>
-          <w:instrText xml:space="preserve"> PAGEREF _Toc242459299 \h </w:instrText>
+          <w:instrText xml:space="preserve"> PAGEREF _Toc244002824 \h </w:instrText>
         </w:r>
         <w:r>
           <w:rPr>
@@ -1657,7 +1657,7 @@
           <w14:ligatures w14:val="standardContextual"/>
         </w:rPr>
       </w:pPr>
-      <w:hyperlink w:anchor="_Toc242459300" w:history="1">
+      <w:hyperlink w:anchor="_Toc244002825" w:history="1">
         <w:r>
           <w:rPr>
             <w:rStyle w:val="Hipervnculo"/>
@@ -1685,7 +1685,7 @@
             <w:noProof/>
             <w:webHidden/>
           </w:rPr>
-          <w:instrText xml:space="preserve"> PAGEREF _Toc242459300 \h </w:instrText>
+          <w:instrText xml:space="preserve"> PAGEREF _Toc244002825 \h </w:instrText>
         </w:r>
         <w:r>
           <w:rPr>
@@ -1733,7 +1733,7 @@
           <w14:ligatures w14:val="standardContextual"/>
         </w:rPr>
       </w:pPr>
-      <w:hyperlink w:anchor="_Toc242459301" w:history="1">
+      <w:hyperlink w:anchor="_Toc244002826" w:history="1">
         <w:r>
           <w:rPr>
             <w:rStyle w:val="Hipervnculo"/>
@@ -1761,7 +1761,7 @@
             <w:noProof/>
             <w:webHidden/>
           </w:rPr>
-          <w:instrText xml:space="preserve"> PAGEREF _Toc242459301 \h </w:instrText>
+          <w:instrText xml:space="preserve"> PAGEREF _Toc244002826 \h </w:instrText>
         </w:r>
         <w:r>
           <w:rPr>
@@ -1809,7 +1809,7 @@
           <w14:ligatures w14:val="standardContextual"/>
         </w:rPr>
       </w:pPr>
-      <w:hyperlink w:anchor="_Toc242459302" w:history="1">
+      <w:hyperlink w:anchor="_Toc244002827" w:history="1">
         <w:r>
           <w:rPr>
             <w:rStyle w:val="Hipervnculo"/>
@@ -1837,7 +1837,7 @@
             <w:noProof/>
             <w:webHidden/>
           </w:rPr>
-          <w:instrText xml:space="preserve"> PAGEREF _Toc242459302 \h </w:instrText>
+          <w:instrText xml:space="preserve"> PAGEREF _Toc244002827 \h </w:instrText>
         </w:r>
         <w:r>
           <w:rPr>
@@ -1885,7 +1885,7 @@
           <w14:ligatures w14:val="standardContextual"/>
         </w:rPr>
       </w:pPr>
-      <w:hyperlink w:anchor="_Toc242459303" w:history="1">
+      <w:hyperlink w:anchor="_Toc244002828" w:history="1">
         <w:r>
           <w:rPr>
             <w:rStyle w:val="Hipervnculo"/>
@@ -1913,7 +1913,7 @@
             <w:noProof/>
             <w:webHidden/>
           </w:rPr>
-          <w:instrText xml:space="preserve"> PAGEREF _Toc242459303 \h </w:instrText>
+          <w:instrText xml:space="preserve"> PAGEREF _Toc244002828 \h </w:instrText>
         </w:r>
         <w:r>
           <w:rPr>
@@ -1961,7 +1961,7 @@
           <w14:ligatures w14:val="standardContextual"/>
         </w:rPr>
       </w:pPr>
-      <w:hyperlink w:anchor="_Toc242459304" w:history="1">
+      <w:hyperlink w:anchor="_Toc244002829" w:history="1">
         <w:r>
           <w:rPr>
             <w:rStyle w:val="Hipervnculo"/>
@@ -1989,7 +1989,7 @@
             <w:noProof/>
             <w:webHidden/>
           </w:rPr>
-          <w:instrText xml:space="preserve"> PAGEREF _Toc242459304 \h </w:instrText>
+          <w:instrText xml:space="preserve"> PAGEREF _Toc244002829 \h </w:instrText>
         </w:r>
         <w:r>
           <w:rPr>
@@ -2037,7 +2037,7 @@
           <w14:ligatures w14:val="standardContextual"/>
         </w:rPr>
       </w:pPr>
-      <w:hyperlink w:anchor="_Toc242459305" w:history="1">
+      <w:hyperlink w:anchor="_Toc244002830" w:history="1">
         <w:r>
           <w:rPr>
             <w:rStyle w:val="Hipervnculo"/>
@@ -2065,7 +2065,7 @@
             <w:noProof/>
             <w:webHidden/>
           </w:rPr>
-          <w:instrText xml:space="preserve"> PAGEREF _Toc242459305 \h </w:instrText>
+          <w:instrText xml:space="preserve"> PAGEREF _Toc244002830 \h </w:instrText>
         </w:r>
         <w:r>
           <w:rPr>
@@ -2113,7 +2113,7 @@
           <w14:ligatures w14:val="standardContextual"/>
         </w:rPr>
       </w:pPr>
-      <w:hyperlink w:anchor="_Toc242459306" w:history="1">
+      <w:hyperlink w:anchor="_Toc244002831" w:history="1">
         <w:r>
           <w:rPr>
             <w:rStyle w:val="Hipervnculo"/>
@@ -2141,7 +2141,7 @@
             <w:noProof/>
             <w:webHidden/>
           </w:rPr>
-          <w:instrText xml:space="preserve"> PAGEREF _Toc242459306 \h </w:instrText>
+          <w:instrText xml:space="preserve"> PAGEREF _Toc244002831 \h </w:instrText>
         </w:r>
         <w:r>
           <w:rPr>
@@ -2189,7 +2189,7 @@
           <w14:ligatures w14:val="standardContextual"/>
         </w:rPr>
       </w:pPr>
-      <w:hyperlink w:anchor="_Toc242459307" w:history="1">
+      <w:hyperlink w:anchor="_Toc244002832" w:history="1">
         <w:r>
           <w:rPr>
             <w:rStyle w:val="Hipervnculo"/>
@@ -2217,7 +2217,7 @@
             <w:noProof/>
             <w:webHidden/>
           </w:rPr>
-          <w:instrText xml:space="preserve"> PAGEREF _Toc242459307 \h </w:instrText>
+          <w:instrText xml:space="preserve"> PAGEREF _Toc244002832 \h </w:instrText>
         </w:r>
         <w:r>
           <w:rPr>
@@ -2237,7 +2237,7 @@
             <w:noProof/>
             <w:webHidden/>
           </w:rPr>
-          <w:t>8</w:t>
+          <w:t>9</w:t>
         </w:r>
         <w:r>
           <w:rPr>
@@ -2265,7 +2265,7 @@
           <w14:ligatures w14:val="standardContextual"/>
         </w:rPr>
       </w:pPr>
-      <w:hyperlink w:anchor="_Toc242459308" w:history="1">
+      <w:hyperlink w:anchor="_Toc244002833" w:history="1">
         <w:r>
           <w:rPr>
             <w:rStyle w:val="Hipervnculo"/>
@@ -2293,7 +2293,7 @@
             <w:noProof/>
             <w:webHidden/>
           </w:rPr>
-          <w:instrText xml:space="preserve"> PAGEREF _Toc242459308 \h </w:instrText>
+          <w:instrText xml:space="preserve"> PAGEREF _Toc244002833 \h </w:instrText>
         </w:r>
         <w:r>
           <w:rPr>
@@ -2341,7 +2341,7 @@
           <w14:ligatures w14:val="standardContextual"/>
         </w:rPr>
       </w:pPr>
-      <w:hyperlink w:anchor="_Toc242459309" w:history="1">
+      <w:hyperlink w:anchor="_Toc244002834" w:history="1">
         <w:r>
           <w:rPr>
             <w:rStyle w:val="Hipervnculo"/>
@@ -2369,7 +2369,7 @@
             <w:noProof/>
             <w:webHidden/>
           </w:rPr>
-          <w:instrText xml:space="preserve"> PAGEREF _Toc242459309 \h </w:instrText>
+          <w:instrText xml:space="preserve"> PAGEREF _Toc244002834 \h </w:instrText>
         </w:r>
         <w:r>
           <w:rPr>
@@ -2417,7 +2417,7 @@
           <w14:ligatures w14:val="standardContextual"/>
         </w:rPr>
       </w:pPr>
-      <w:hyperlink w:anchor="_Toc242459310" w:history="1">
+      <w:hyperlink w:anchor="_Toc244002835" w:history="1">
         <w:r>
           <w:rPr>
             <w:rStyle w:val="Hipervnculo"/>
@@ -2445,7 +2445,7 @@
             <w:noProof/>
             <w:webHidden/>
           </w:rPr>
-          <w:instrText xml:space="preserve"> PAGEREF _Toc242459310 \h </w:instrText>
+          <w:instrText xml:space="preserve"> PAGEREF _Toc244002835 \h </w:instrText>
         </w:r>
         <w:r>
           <w:rPr>
@@ -2465,7 +2465,7 @@
             <w:noProof/>
             <w:webHidden/>
           </w:rPr>
-          <w:t>9</w:t>
+          <w:t>10</w:t>
         </w:r>
         <w:r>
           <w:rPr>
@@ -2493,7 +2493,7 @@
           <w14:ligatures w14:val="standardContextual"/>
         </w:rPr>
       </w:pPr>
-      <w:hyperlink w:anchor="_Toc242459311" w:history="1">
+      <w:hyperlink w:anchor="_Toc244002836" w:history="1">
         <w:r>
           <w:rPr>
             <w:rStyle w:val="Hipervnculo"/>
@@ -2521,7 +2521,7 @@
             <w:noProof/>
             <w:webHidden/>
           </w:rPr>
-          <w:instrText xml:space="preserve"> PAGEREF _Toc242459311 \h </w:instrText>
+          <w:instrText xml:space="preserve"> PAGEREF _Toc244002836 \h </w:instrText>
         </w:r>
         <w:r>
           <w:rPr>
@@ -2569,7 +2569,7 @@
           <w14:ligatures w14:val="standardContextual"/>
         </w:rPr>
       </w:pPr>
-      <w:hyperlink w:anchor="_Toc242459312" w:history="1">
+      <w:hyperlink w:anchor="_Toc244002837" w:history="1">
         <w:r>
           <w:rPr>
             <w:rStyle w:val="Hipervnculo"/>
@@ -2597,7 +2597,7 @@
             <w:noProof/>
             <w:webHidden/>
           </w:rPr>
-          <w:instrText xml:space="preserve"> PAGEREF _Toc242459312 \h </w:instrText>
+          <w:instrText xml:space="preserve"> PAGEREF _Toc244002837 \h </w:instrText>
         </w:r>
         <w:r>
           <w:rPr>
@@ -2645,7 +2645,7 @@
           <w14:ligatures w14:val="standardContextual"/>
         </w:rPr>
       </w:pPr>
-      <w:hyperlink w:anchor="_Toc242459313" w:history="1">
+      <w:hyperlink w:anchor="_Toc244002838" w:history="1">
         <w:r>
           <w:rPr>
             <w:rStyle w:val="Hipervnculo"/>
@@ -2673,7 +2673,7 @@
             <w:noProof/>
             <w:webHidden/>
           </w:rPr>
-          <w:instrText xml:space="preserve"> PAGEREF _Toc242459313 \h </w:instrText>
+          <w:instrText xml:space="preserve"> PAGEREF _Toc244002838 \h </w:instrText>
         </w:r>
         <w:r>
           <w:rPr>
@@ -2721,7 +2721,7 @@
           <w14:ligatures w14:val="standardContextual"/>
         </w:rPr>
       </w:pPr>
-      <w:hyperlink w:anchor="_Toc242459314" w:history="1">
+      <w:hyperlink w:anchor="_Toc244002839" w:history="1">
         <w:r>
           <w:rPr>
             <w:rStyle w:val="Hipervnculo"/>
@@ -2749,7 +2749,7 @@
             <w:noProof/>
             <w:webHidden/>
           </w:rPr>
-          <w:instrText xml:space="preserve"> PAGEREF _Toc242459314 \h </w:instrText>
+          <w:instrText xml:space="preserve"> PAGEREF _Toc244002839 \h </w:instrText>
         </w:r>
         <w:r>
           <w:rPr>
@@ -2797,7 +2797,7 @@
           <w14:ligatures w14:val="standardContextual"/>
         </w:rPr>
       </w:pPr>
-      <w:hyperlink w:anchor="_Toc242459315" w:history="1">
+      <w:hyperlink w:anchor="_Toc244002840" w:history="1">
         <w:r>
           <w:rPr>
             <w:rStyle w:val="Hipervnculo"/>
@@ -2825,7 +2825,7 @@
             <w:noProof/>
             <w:webHidden/>
           </w:rPr>
-          <w:instrText xml:space="preserve"> PAGEREF _Toc242459315 \h </w:instrText>
+          <w:instrText xml:space="preserve"> PAGEREF _Toc244002840 \h </w:instrText>
         </w:r>
         <w:r>
           <w:rPr>
@@ -2873,7 +2873,7 @@
           <w14:ligatures w14:val="standardContextual"/>
         </w:rPr>
       </w:pPr>
-      <w:hyperlink w:anchor="_Toc242459316" w:history="1">
+      <w:hyperlink w:anchor="_Toc244002841" w:history="1">
         <w:r>
           <w:rPr>
             <w:rStyle w:val="Hipervnculo"/>
@@ -2901,7 +2901,7 @@
             <w:noProof/>
             <w:webHidden/>
           </w:rPr>
-          <w:instrText xml:space="preserve"> PAGEREF _Toc242459316 \h </w:instrText>
+          <w:instrText xml:space="preserve"> PAGEREF _Toc244002841 \h </w:instrText>
         </w:r>
         <w:r>
           <w:rPr>
@@ -2949,7 +2949,7 @@
           <w14:ligatures w14:val="standardContextual"/>
         </w:rPr>
       </w:pPr>
-      <w:hyperlink w:anchor="_Toc242459317" w:history="1">
+      <w:hyperlink w:anchor="_Toc244002842" w:history="1">
         <w:r>
           <w:rPr>
             <w:rStyle w:val="Hipervnculo"/>
@@ -2977,7 +2977,7 @@
             <w:noProof/>
             <w:webHidden/>
           </w:rPr>
-          <w:instrText xml:space="preserve"> PAGEREF _Toc242459317 \h </w:instrText>
+          <w:instrText xml:space="preserve"> PAGEREF _Toc244002842 \h </w:instrText>
         </w:r>
         <w:r>
           <w:rPr>
@@ -3025,7 +3025,7 @@
           <w14:ligatures w14:val="standardContextual"/>
         </w:rPr>
       </w:pPr>
-      <w:hyperlink w:anchor="_Toc242459318" w:history="1">
+      <w:hyperlink w:anchor="_Toc244002843" w:history="1">
         <w:r>
           <w:rPr>
             <w:rStyle w:val="Hipervnculo"/>
@@ -3053,7 +3053,7 @@
             <w:noProof/>
             <w:webHidden/>
           </w:rPr>
-          <w:instrText xml:space="preserve"> PAGEREF _Toc242459318 \h </w:instrText>
+          <w:instrText xml:space="preserve"> PAGEREF _Toc244002843 \h </w:instrText>
         </w:r>
         <w:r>
           <w:rPr>
@@ -3101,7 +3101,7 @@
           <w14:ligatures w14:val="standardContextual"/>
         </w:rPr>
       </w:pPr>
-      <w:hyperlink w:anchor="_Toc242459319" w:history="1">
+      <w:hyperlink w:anchor="_Toc244002844" w:history="1">
         <w:r>
           <w:rPr>
             <w:rStyle w:val="Hipervnculo"/>
@@ -3129,7 +3129,7 @@
             <w:noProof/>
             <w:webHidden/>
           </w:rPr>
-          <w:instrText xml:space="preserve"> PAGEREF _Toc242459319 \h </w:instrText>
+          <w:instrText xml:space="preserve"> PAGEREF _Toc244002844 \h </w:instrText>
         </w:r>
         <w:r>
           <w:rPr>
@@ -3193,7 +3193,7 @@
           <w:lang w:val="en-US"/>
         </w:rPr>
       </w:pPr>
-      <w:bookmarkStart w:id="0" w:name="_Toc242459286"/>
+      <w:bookmarkStart w:id="0" w:name="_Toc244002811"/>
       <w:r>
         <w:rPr>
           <w:lang w:val="en-US"/>
@@ -3238,7 +3238,7 @@
           <w:lang w:val="en-US"/>
         </w:rPr>
       </w:pPr>
-      <w:bookmarkStart w:id="1" w:name="_Toc242459287"/>
+      <w:bookmarkStart w:id="1" w:name="_Toc244002812"/>
       <w:r>
         <w:rPr>
           <w:lang w:val="en-US"/>
@@ -3254,7 +3254,7 @@
           <w:lang w:val="en-US"/>
         </w:rPr>
       </w:pPr>
-      <w:bookmarkStart w:id="2" w:name="_Toc242459288"/>
+      <w:bookmarkStart w:id="2" w:name="_Toc244002813"/>
       <w:r>
         <w:rPr>
           <w:lang w:val="en-US"/>
@@ -3298,7 +3298,7 @@
           <w:lang w:val="en-US"/>
         </w:rPr>
       </w:pPr>
-      <w:bookmarkStart w:id="3" w:name="_Toc242459289"/>
+      <w:bookmarkStart w:id="3" w:name="_Toc244002814"/>
       <w:r>
         <w:rPr>
           <w:lang w:val="en-US"/>
@@ -3329,7 +3329,7 @@
           <w:lang w:val="en-US"/>
         </w:rPr>
       </w:pPr>
-      <w:bookmarkStart w:id="4" w:name="_Toc242459290"/>
+      <w:bookmarkStart w:id="4" w:name="_Toc244002815"/>
       <w:r>
         <w:rPr>
           <w:lang w:val="en-US"/>
@@ -3359,7 +3359,7 @@
           <w:lang w:val="en-US"/>
         </w:rPr>
       </w:pPr>
-      <w:bookmarkStart w:id="5" w:name="_Toc242459291"/>
+      <w:bookmarkStart w:id="5" w:name="_Toc244002816"/>
       <w:r>
         <w:rPr>
           <w:lang w:val="en-US"/>
@@ -3470,7 +3470,7 @@
           <w:lang w:val="en-US"/>
         </w:rPr>
       </w:pPr>
-      <w:bookmarkStart w:id="6" w:name="_Toc242459292"/>
+      <w:bookmarkStart w:id="6" w:name="_Toc244002817"/>
       <w:r>
         <w:rPr>
           <w:lang w:val="en-US"/>
@@ -3515,7 +3515,7 @@
           <w:lang w:val="en-US"/>
         </w:rPr>
       </w:pPr>
-      <w:bookmarkStart w:id="7" w:name="_Toc242459293"/>
+      <w:bookmarkStart w:id="7" w:name="_Toc244002818"/>
       <w:r>
         <w:rPr>
           <w:lang w:val="en-US"/>
@@ -3948,7 +3948,7 @@
           <w:lang w:val="en-US"/>
         </w:rPr>
       </w:pPr>
-      <w:bookmarkStart w:id="8" w:name="_Toc242459294"/>
+      <w:bookmarkStart w:id="8" w:name="_Toc244002819"/>
       <w:r>
         <w:rPr>
           <w:lang w:val="en-US"/>
@@ -4736,7 +4736,7 @@
           <w:lang w:val="en-US"/>
         </w:rPr>
       </w:pPr>
-      <w:bookmarkStart w:id="9" w:name="_Toc242459295"/>
+      <w:bookmarkStart w:id="9" w:name="_Toc244002820"/>
       <w:r>
         <w:rPr>
           <w:lang w:val="en-US"/>
@@ -4753,7 +4753,7 @@
           <w:lang w:val="en-US"/>
         </w:rPr>
       </w:pPr>
-      <w:bookmarkStart w:id="10" w:name="_Toc242459296"/>
+      <w:bookmarkStart w:id="10" w:name="_Toc244002821"/>
       <w:r>
         <w:rPr>
           <w:lang w:val="en-US"/>
@@ -4797,7 +4797,7 @@
           <w:lang w:val="en-US"/>
         </w:rPr>
       </w:pPr>
-      <w:bookmarkStart w:id="11" w:name="_Toc242459297"/>
+      <w:bookmarkStart w:id="11" w:name="_Toc244002822"/>
       <w:r>
         <w:rPr>
           <w:lang w:val="en-US"/>
@@ -5135,7 +5135,7 @@
           <w:lang w:val="en-US"/>
         </w:rPr>
       </w:pPr>
-      <w:bookmarkStart w:id="12" w:name="_Toc242459298"/>
+      <w:bookmarkStart w:id="12" w:name="_Toc244002823"/>
       <w:r>
         <w:rPr>
           <w:lang w:val="en-US"/>
@@ -5288,7 +5288,7 @@
           <w:lang w:val="en-US"/>
         </w:rPr>
       </w:pPr>
-      <w:bookmarkStart w:id="13" w:name="_Toc242459299"/>
+      <w:bookmarkStart w:id="13" w:name="_Toc244002824"/>
       <w:r>
         <w:rPr>
           <w:lang w:val="en-US"/>
@@ -5389,7 +5389,7 @@
         <w:rPr>
           <w:lang w:val="en-US"/>
         </w:rPr>
-        <w:t>The system depends on external services: MediaPipe, an SMTP mail server, and, in the future, Firebase Cloud Messaging.</w:t>
+        <w:t>The system depends on MediaPipe Tasks Vision (hand and pose detection), a custom TensorFlow.js model trained on 54 signs, and an SMTP mail server. It does not use Firebase: notifications are delivered in the app and by email (ADR-007).</w:t>
       </w:r>
     </w:p>
     <w:p>
@@ -5399,7 +5399,7 @@
           <w:lang w:val="en-US"/>
         </w:rPr>
       </w:pPr>
-      <w:bookmarkStart w:id="14" w:name="_Toc242459300"/>
+      <w:bookmarkStart w:id="14" w:name="_Toc244002825"/>
       <w:r>
         <w:rPr>
           <w:lang w:val="en-US"/>
@@ -5415,7 +5415,7 @@
           <w:lang w:val="en-US"/>
         </w:rPr>
       </w:pPr>
-      <w:bookmarkStart w:id="15" w:name="_Toc242459301"/>
+      <w:bookmarkStart w:id="15" w:name="_Toc244002826"/>
       <w:r>
         <w:rPr>
           <w:lang w:val="en-US"/>
@@ -5431,7 +5431,7 @@
           <w:lang w:val="en-US"/>
         </w:rPr>
       </w:pPr>
-      <w:bookmarkStart w:id="16" w:name="_Toc242459302"/>
+      <w:bookmarkStart w:id="16" w:name="_Toc244002827"/>
       <w:r>
         <w:rPr>
           <w:lang w:val="en-US"/>
@@ -5461,7 +5461,7 @@
           <w:lang w:val="en-US"/>
         </w:rPr>
       </w:pPr>
-      <w:bookmarkStart w:id="17" w:name="_Toc242459303"/>
+      <w:bookmarkStart w:id="17" w:name="_Toc244002828"/>
       <w:r>
         <w:rPr>
           <w:lang w:val="en-US"/>
@@ -5553,7 +5553,7 @@
           <w:lang w:val="en-US"/>
         </w:rPr>
       </w:pPr>
-      <w:bookmarkStart w:id="18" w:name="_Toc242459304"/>
+      <w:bookmarkStart w:id="18" w:name="_Toc244002829"/>
       <w:r>
         <w:rPr>
           <w:lang w:val="en-US"/>
@@ -5635,6 +5635,7 @@
         <w:rPr>
           <w:lang w:val="en-US"/>
         </w:rPr>
+        <w:lastRenderedPageBreak/>
         <w:t>Server with Docker and Docker Compose for the backend.</w:t>
       </w:r>
     </w:p>
@@ -5645,12 +5646,11 @@
           <w:lang w:val="en-US"/>
         </w:rPr>
       </w:pPr>
-      <w:bookmarkStart w:id="19" w:name="_Toc242459305"/>
+      <w:bookmarkStart w:id="19" w:name="_Toc244002830"/>
       <w:r>
         <w:rPr>
           <w:lang w:val="en-US"/>
         </w:rPr>
-        <w:lastRenderedPageBreak/>
         <w:t>Communication interfaces</w:t>
       </w:r>
       <w:bookmarkEnd w:id="19"/>
@@ -5738,7 +5738,7 @@
           <w:lang w:val="en-US"/>
         </w:rPr>
       </w:pPr>
-      <w:bookmarkStart w:id="20" w:name="_Toc242459306"/>
+      <w:bookmarkStart w:id="20" w:name="_Toc244002831"/>
       <w:r>
         <w:rPr>
           <w:lang w:val="en-US"/>
@@ -6811,6 +6811,32 @@
     </w:tbl>
     <w:p>
       <w:pPr>
+        <w:pStyle w:val="APATexto"/>
+        <w:spacing w:before="80" w:after="200" w:line="240" w:lineRule="auto"/>
+        <w:ind w:firstLine="0"/>
+        <w:rPr>
+          <w:sz w:val="20"/>
+          <w:lang w:val="en-US"/>
+        </w:rPr>
+      </w:pPr>
+      <w:r>
+        <w:rPr>
+          <w:i/>
+          <w:sz w:val="20"/>
+          <w:lang w:val="en-US"/>
+        </w:rPr>
+        <w:t>Note.</w:t>
+      </w:r>
+      <w:r>
+        <w:rPr>
+          <w:sz w:val="20"/>
+          <w:lang w:val="en-US"/>
+        </w:rPr>
+        <w:t xml:space="preserve"> The status of RF8 to RF11 is pending a team decision.</w:t>
+      </w:r>
+    </w:p>
+    <w:p>
+      <w:pPr>
         <w:spacing w:after="80"/>
         <w:rPr>
           <w:lang w:val="en-US"/>
@@ -6824,11 +6850,12 @@
           <w:lang w:val="en-US"/>
         </w:rPr>
       </w:pPr>
-      <w:bookmarkStart w:id="21" w:name="_Toc242459307"/>
+      <w:bookmarkStart w:id="21" w:name="_Toc244002832"/>
       <w:r>
         <w:rPr>
           <w:lang w:val="en-US"/>
         </w:rPr>
+        <w:lastRenderedPageBreak/>
         <w:t>Identity module (iam-service)</w:t>
       </w:r>
       <w:bookmarkEnd w:id="21"/>
@@ -7017,7 +7044,7 @@
               <w:rPr>
                 <w:lang w:val="en-US"/>
               </w:rPr>
-              <w:t>Register a user with name, date of birth, username, email, and a valid password; the account is created as INACTIVE until the email is verified</w:t>
+              <w:t>Register a user with name, email, a valid password, and acceptance of the terms with date and version; the account is created as INACTIVE until the email is verified</w:t>
             </w:r>
           </w:p>
         </w:tc>
@@ -7162,7 +7189,6 @@
               <w:rPr>
                 <w:lang w:val="en-US"/>
               </w:rPr>
-              <w:lastRenderedPageBreak/>
               <w:t>FR-003</w:t>
             </w:r>
           </w:p>
@@ -7491,7 +7517,7 @@
               <w:rPr>
                 <w:lang w:val="en-US"/>
               </w:rPr>
-              <w:t>FR-007</w:t>
+              <w:t>FR-008</w:t>
             </w:r>
           </w:p>
         </w:tc>
@@ -7510,7 +7536,7 @@
               <w:rPr>
                 <w:lang w:val="en-US"/>
               </w:rPr>
-              <w:t>Permanently lock the account when the escalation is exhausted; only the administrator can restore it</w:t>
+              <w:t>Registration and sign-in with Google and Facebook</w:t>
             </w:r>
           </w:p>
         </w:tc>
@@ -7573,7 +7599,7 @@
               <w:rPr>
                 <w:lang w:val="en-US"/>
               </w:rPr>
-              <w:t>FR-008</w:t>
+              <w:t>FR-010</w:t>
             </w:r>
           </w:p>
         </w:tc>
@@ -7592,7 +7618,7 @@
               <w:rPr>
                 <w:lang w:val="en-US"/>
               </w:rPr>
-              <w:t>Registration and sign-in with Google and Facebook</w:t>
+              <w:t>Recover the password with a single-use code that expires</w:t>
             </w:r>
           </w:p>
         </w:tc>
@@ -7655,7 +7681,7 @@
               <w:rPr>
                 <w:lang w:val="en-US"/>
               </w:rPr>
-              <w:t>FR-010</w:t>
+              <w:t>FR-012</w:t>
             </w:r>
           </w:p>
         </w:tc>
@@ -7674,7 +7700,7 @@
               <w:rPr>
                 <w:lang w:val="en-US"/>
               </w:rPr>
-              <w:t>Recover the password with a single-use code that expires</w:t>
+              <w:t>Rotate refresh tokens and detect their reuse</w:t>
             </w:r>
           </w:p>
         </w:tc>
@@ -7737,7 +7763,7 @@
               <w:rPr>
                 <w:lang w:val="en-US"/>
               </w:rPr>
-              <w:t>FR-012</w:t>
+              <w:t>FR-014</w:t>
             </w:r>
           </w:p>
         </w:tc>
@@ -7756,7 +7782,7 @@
               <w:rPr>
                 <w:lang w:val="en-US"/>
               </w:rPr>
-              <w:t>Rotate refresh tokens and detect their reuse</w:t>
+              <w:t>Delete the account by anonymizing the data (Ley 1581 de 2012)</w:t>
             </w:r>
           </w:p>
         </w:tc>
@@ -7775,7 +7801,7 @@
               <w:rPr>
                 <w:lang w:val="en-US"/>
               </w:rPr>
-              <w:t>RF1</w:t>
+              <w:t>RF1, RF5</w:t>
             </w:r>
           </w:p>
         </w:tc>
@@ -7794,7 +7820,7 @@
               <w:rPr>
                 <w:lang w:val="en-US"/>
               </w:rPr>
-              <w:t>Must</w:t>
+              <w:t>Should</w:t>
             </w:r>
           </w:p>
         </w:tc>
@@ -7819,88 +7845,6 @@
               <w:rPr>
                 <w:lang w:val="en-US"/>
               </w:rPr>
-              <w:t>FR-014</w:t>
-            </w:r>
-          </w:p>
-        </w:tc>
-        <w:tc>
-          <w:tcPr>
-            <w:tcW w:w="5839" w:type="dxa"/>
-          </w:tcPr>
-          <w:p>
-            <w:pPr>
-              <w:pStyle w:val="APACelda"/>
-              <w:rPr>
-                <w:lang w:val="en-US"/>
-              </w:rPr>
-            </w:pPr>
-            <w:r>
-              <w:rPr>
-                <w:lang w:val="en-US"/>
-              </w:rPr>
-              <w:t>Delete the account by anonymizing the data (Ley 1581 de 2012)</w:t>
-            </w:r>
-          </w:p>
-        </w:tc>
-        <w:tc>
-          <w:tcPr>
-            <w:tcW w:w="1134" w:type="dxa"/>
-          </w:tcPr>
-          <w:p>
-            <w:pPr>
-              <w:pStyle w:val="APACelda"/>
-              <w:rPr>
-                <w:lang w:val="en-US"/>
-              </w:rPr>
-            </w:pPr>
-            <w:r>
-              <w:rPr>
-                <w:lang w:val="en-US"/>
-              </w:rPr>
-              <w:t>RF1, RF5</w:t>
-            </w:r>
-          </w:p>
-        </w:tc>
-        <w:tc>
-          <w:tcPr>
-            <w:tcW w:w="1134" w:type="dxa"/>
-          </w:tcPr>
-          <w:p>
-            <w:pPr>
-              <w:pStyle w:val="APACelda"/>
-              <w:rPr>
-                <w:lang w:val="en-US"/>
-              </w:rPr>
-            </w:pPr>
-            <w:r>
-              <w:rPr>
-                <w:lang w:val="en-US"/>
-              </w:rPr>
-              <w:t>Should</w:t>
-            </w:r>
-          </w:p>
-        </w:tc>
-      </w:tr>
-      <w:tr>
-        <w:trPr>
-          <w:cantSplit/>
-          <w:jc w:val="center"/>
-        </w:trPr>
-        <w:tc>
-          <w:tcPr>
-            <w:tcW w:w="964" w:type="dxa"/>
-          </w:tcPr>
-          <w:p>
-            <w:pPr>
-              <w:pStyle w:val="APACelda"/>
-              <w:rPr>
-                <w:lang w:val="en-US"/>
-              </w:rPr>
-            </w:pPr>
-            <w:r>
-              <w:rPr>
-                <w:lang w:val="en-US"/>
-              </w:rPr>
               <w:t>FR-015</w:t>
             </w:r>
           </w:p>
@@ -7996,7 +7940,7 @@
           <w:lang w:val="en-US"/>
         </w:rPr>
       </w:pPr>
-      <w:bookmarkStart w:id="22" w:name="_Toc242459308"/>
+      <w:bookmarkStart w:id="22" w:name="_Toc244002833"/>
       <w:r>
         <w:rPr>
           <w:lang w:val="en-US"/>
@@ -8494,7 +8438,7 @@
           <w:lang w:val="en-US"/>
         </w:rPr>
       </w:pPr>
-      <w:bookmarkStart w:id="23" w:name="_Toc242459309"/>
+      <w:bookmarkStart w:id="23" w:name="_Toc244002834"/>
       <w:r>
         <w:rPr>
           <w:lang w:val="en-US"/>
@@ -8933,7 +8877,13 @@
               <w:rPr>
                 <w:lang w:val="en-US"/>
               </w:rPr>
-              <w:t>Choose the interface language (Spanish / English)</w:t>
+              <w:t xml:space="preserve">Choose the interface language </w:t>
+            </w:r>
+            <w:r>
+              <w:rPr>
+                <w:lang w:val="en-US"/>
+              </w:rPr>
+              <w:t>(Spanish, English, French, and Portuguese)</w:t>
             </w:r>
           </w:p>
         </w:tc>
@@ -9097,7 +9047,13 @@
               <w:rPr>
                 <w:lang w:val="en-US"/>
               </w:rPr>
-              <w:t>Deliver notifications only through visual channels (push, in-app, email)</w:t>
+              <w:t xml:space="preserve">Deliver notifications </w:t>
+            </w:r>
+            <w:r>
+              <w:rPr>
+                <w:lang w:val="en-US"/>
+              </w:rPr>
+              <w:t>only through visual channels: in-app and email (no push, ADR-007)</w:t>
             </w:r>
           </w:p>
         </w:tc>
@@ -9238,7 +9194,7 @@
           <w:lang w:val="en-US"/>
         </w:rPr>
       </w:pPr>
-      <w:bookmarkStart w:id="24" w:name="_Toc242459310"/>
+      <w:bookmarkStart w:id="24" w:name="_Toc244002835"/>
       <w:r>
         <w:rPr>
           <w:lang w:val="en-US"/>
@@ -9494,7 +9450,6 @@
               <w:rPr>
                 <w:lang w:val="en-US"/>
               </w:rPr>
-              <w:lastRenderedPageBreak/>
               <w:t>FR-302</w:t>
             </w:r>
           </w:p>
@@ -9983,7 +9938,7 @@
           <w:lang w:val="en-US"/>
         </w:rPr>
       </w:pPr>
-      <w:bookmarkStart w:id="25" w:name="_Toc242459311"/>
+      <w:bookmarkStart w:id="25" w:name="_Toc244002836"/>
       <w:r>
         <w:rPr>
           <w:lang w:val="en-US"/>
@@ -10340,7 +10295,7 @@
               <w:rPr>
                 <w:lang w:val="en-US"/>
               </w:rPr>
-              <w:t>Record the model that produced each translation and its confidence</w:t>
+              <w:t>Record the confidence and the source (engine) of each translation</w:t>
             </w:r>
           </w:p>
         </w:tc>
@@ -10891,7 +10846,7 @@
           <w:lang w:val="en-US"/>
         </w:rPr>
       </w:pPr>
-      <w:bookmarkStart w:id="26" w:name="_Toc242459312"/>
+      <w:bookmarkStart w:id="26" w:name="_Toc244002837"/>
       <w:r>
         <w:rPr>
           <w:lang w:val="en-US"/>
@@ -11639,6 +11594,7 @@
               <w:rPr>
                 <w:lang w:val="en-US"/>
               </w:rPr>
+              <w:lastRenderedPageBreak/>
               <w:t>FR-905</w:t>
             </w:r>
           </w:p>
@@ -11717,12 +11673,11 @@
           <w:lang w:val="en-US"/>
         </w:rPr>
       </w:pPr>
-      <w:bookmarkStart w:id="27" w:name="_Toc242459313"/>
+      <w:bookmarkStart w:id="27" w:name="_Toc244002838"/>
       <w:r>
         <w:rPr>
           <w:lang w:val="en-US"/>
         </w:rPr>
-        <w:lastRenderedPageBreak/>
         <w:t>Nonfunctional requirements</w:t>
       </w:r>
       <w:bookmarkEnd w:id="27"/>
@@ -12640,7 +12595,7 @@
           <w:lang w:val="en-US"/>
         </w:rPr>
       </w:pPr>
-      <w:bookmarkStart w:id="28" w:name="_Toc242459314"/>
+      <w:bookmarkStart w:id="28" w:name="_Toc244002839"/>
       <w:r>
         <w:rPr>
           <w:lang w:val="en-US"/>
@@ -12657,7 +12612,7 @@
           <w:lang w:val="en-US"/>
         </w:rPr>
       </w:pPr>
-      <w:bookmarkStart w:id="29" w:name="_Toc242459315"/>
+      <w:bookmarkStart w:id="29" w:name="_Toc244002840"/>
       <w:r>
         <w:rPr>
           <w:lang w:val="en-US"/>
@@ -12783,7 +12738,7 @@
           <w:lang w:val="en-US"/>
         </w:rPr>
       </w:pPr>
-      <w:bookmarkStart w:id="30" w:name="_Toc242459316"/>
+      <w:bookmarkStart w:id="30" w:name="_Toc244002841"/>
       <w:r>
         <w:rPr>
           <w:lang w:val="en-US"/>
@@ -15337,7 +15292,7 @@
           <w:lang w:val="en-US"/>
         </w:rPr>
       </w:pPr>
-      <w:bookmarkStart w:id="31" w:name="_Toc242459317"/>
+      <w:bookmarkStart w:id="31" w:name="_Toc244002842"/>
       <w:r>
         <w:rPr>
           <w:lang w:val="en-US"/>
@@ -15357,7 +15312,13 @@
         <w:rPr>
           <w:lang w:val="en-US"/>
         </w:rPr>
-        <w:t>Each functional requirement is linked to the user story that plans it and to the tables that persist it. The complete traceability matrix is maintained in the documentation repository (04-requirements/traceability-matrix.md). Table 18 summarizes the current coverage.</w:t>
+        <w:t xml:space="preserve">Each functional requirement is linked to the user story that plans it and to the tables that persist it. The complete traceability matrix is maintained in the documentation repository (04-requirements/traceability-matrix.md). </w:t>
+      </w:r>
+      <w:r>
+        <w:rPr>
+          <w:lang w:val="en-US"/>
+        </w:rPr>
+        <w:t>Table 18 summarizes the implementation status of the 79 detailed requirements according to that matrix.</w:t>
       </w:r>
     </w:p>
     <w:p>
@@ -15393,7 +15354,7 @@
           <w:i/>
           <w:lang w:val="en-US"/>
         </w:rPr>
-        <w:t>Traceability coverage summary</w:t>
+        <w:t>Implementation status of the detailed requirements</w:t>
       </w:r>
     </w:p>
     <w:tbl>
@@ -15438,7 +15399,7 @@
                 <w:b/>
                 <w:lang w:val="en-US"/>
               </w:rPr>
-              <w:t>Relationship</w:t>
+              <w:t>Status</w:t>
             </w:r>
           </w:p>
         </w:tc>
@@ -15458,7 +15419,7 @@
                 <w:b/>
                 <w:lang w:val="en-US"/>
               </w:rPr>
-              <w:t>Coverage</w:t>
+              <w:t>Detailed requirements</w:t>
             </w:r>
           </w:p>
         </w:tc>
@@ -15483,7 +15444,7 @@
               <w:rPr>
                 <w:lang w:val="en-US"/>
               </w:rPr>
-              <w:t>SRS requirements with at least one detailed requirement</w:t>
+              <w:t>Covered</w:t>
             </w:r>
           </w:p>
         </w:tc>
@@ -15502,7 +15463,7 @@
               <w:rPr>
                 <w:lang w:val="en-US"/>
               </w:rPr>
-              <w:t>15 of 15</w:t>
+              <w:t>47</w:t>
             </w:r>
           </w:p>
         </w:tc>
@@ -15527,7 +15488,7 @@
               <w:rPr>
                 <w:lang w:val="en-US"/>
               </w:rPr>
-              <w:t>Detailed requirements with user story</w:t>
+              <w:t>Partial</w:t>
             </w:r>
           </w:p>
         </w:tc>
@@ -15546,7 +15507,7 @@
               <w:rPr>
                 <w:lang w:val="en-US"/>
               </w:rPr>
-              <w:t>79 of 79</w:t>
+              <w:t>10</w:t>
             </w:r>
           </w:p>
         </w:tc>
@@ -15571,7 +15532,7 @@
               <w:rPr>
                 <w:lang w:val="en-US"/>
               </w:rPr>
-              <w:t>Detailed requirements persisted in the data model</w:t>
+              <w:t>Not implemented</w:t>
             </w:r>
           </w:p>
         </w:tc>
@@ -15590,7 +15551,7 @@
               <w:rPr>
                 <w:lang w:val="en-US"/>
               </w:rPr>
-              <w:t>74 of 79 (the remaining 5 do not persist data)</w:t>
+              <w:t>20</w:t>
             </w:r>
           </w:p>
         </w:tc>
@@ -15615,7 +15576,7 @@
               <w:rPr>
                 <w:lang w:val="en-US"/>
               </w:rPr>
-              <w:t>Data model tables used by at least one requirement</w:t>
+              <w:t>Not verified</w:t>
             </w:r>
           </w:p>
         </w:tc>
@@ -15634,7 +15595,53 @@
               <w:rPr>
                 <w:lang w:val="en-US"/>
               </w:rPr>
-              <w:t>25 of 29</w:t>
+              <w:t>2</w:t>
+            </w:r>
+          </w:p>
+        </w:tc>
+      </w:tr>
+      <w:tr>
+        <w:trPr>
+          <w:cantSplit/>
+          <w:jc w:val="center"/>
+        </w:trPr>
+        <w:tc>
+          <w:tcPr>
+            <w:tcW w:w="5669" w:type="dxa"/>
+          </w:tcPr>
+          <w:p>
+            <w:pPr>
+              <w:pStyle w:val="APACelda"/>
+              <w:rPr>
+                <w:lang w:val="en-US"/>
+              </w:rPr>
+            </w:pPr>
+            <w:r>
+              <w:rPr>
+                <w:b/>
+                <w:lang w:val="en-US"/>
+              </w:rPr>
+              <w:t>Total</w:t>
+            </w:r>
+          </w:p>
+        </w:tc>
+        <w:tc>
+          <w:tcPr>
+            <w:tcW w:w="3402" w:type="dxa"/>
+          </w:tcPr>
+          <w:p>
+            <w:pPr>
+              <w:pStyle w:val="APACelda"/>
+              <w:rPr>
+                <w:lang w:val="en-US"/>
+              </w:rPr>
+            </w:pPr>
+            <w:r>
+              <w:rPr>
+                <w:b/>
+                <w:lang w:val="en-US"/>
+              </w:rPr>
+              <w:t>79</w:t>
             </w:r>
           </w:p>
         </w:tc>
@@ -15655,7 +15662,7 @@
           <w:lang w:val="en-US"/>
         </w:rPr>
       </w:pPr>
-      <w:bookmarkStart w:id="32" w:name="_Toc242459318"/>
+      <w:bookmarkStart w:id="32" w:name="_Toc244002843"/>
       <w:r>
         <w:rPr>
           <w:lang w:val="en-US"/>
@@ -15675,14 +15682,26 @@
         <w:rPr>
           <w:lang w:val="en-US"/>
         </w:rPr>
-        <w:t xml:space="preserve">The specification defines eleven functional requirements, broken down into 79 detailed requirements, and twelve nonfunctional requirements with measurable metrics. Accessibility and </w:t>
+        <w:t xml:space="preserve">The specification defines eleven functional requirements, broken down into 79 detailed </w:t>
       </w:r>
       <w:r>
         <w:rPr>
           <w:lang w:val="en-US"/>
         </w:rPr>
         <w:lastRenderedPageBreak/>
-        <w:t>personal data protection are established as primary constraints due to the nature of the users and of the biometric information the system handles.</w:t>
+        <w:t xml:space="preserve">requirements, </w:t>
+      </w:r>
+      <w:r>
+        <w:rPr>
+          <w:lang w:val="en-US"/>
+        </w:rPr>
+        <w:t>and twelve nonfunctional requirements. Of the 79 detailed requirements, 47 are covered, 10 are partial, 20 are not implemented, and 2 are not verified.</w:t>
+      </w:r>
+      <w:r>
+        <w:rPr>
+          <w:lang w:val="en-US"/>
+        </w:rPr>
+        <w:t xml:space="preserve"> Accessibility and personal data protection are established as primary constraints due to the nature of the users and of the biometric information the system handles.</w:t>
       </w:r>
     </w:p>
     <w:p>
@@ -15707,7 +15726,7 @@
           <w:lang w:val="en-US"/>
         </w:rPr>
       </w:pPr>
-      <w:bookmarkStart w:id="33" w:name="_Toc242459319"/>
+      <w:bookmarkStart w:id="33" w:name="_Toc244002844"/>
       <w:r>
         <w:rPr>
           <w:lang w:val="en-US"/>

</xml_diff>